<commit_message>
docs: document payload encryption (crypto-js) across SDD, Postman and cURL guides
- SDD (md+docx): security section 7-bis, crypto-js in drivers/architecture, stack table
- Postman: 'Encrypted (P2C)' folder with CryptoJS pre-request/test scripts + payloadKey var
- README + cURL guide (md+docx): encryption section and crypto-js library
- expected-results matrices updated with encrypted cases

Co-Authored-By: Claude Fable 5 <noreply@anthropic.com>
</commit_message>
<xml_diff>
--- a/docs/sdd/SDD-employee-api-spi-v1.0.docx
+++ b/docs/sdd/SDD-employee-api-spi-v1.0.docx
@@ -5078,6 +5078,792 @@
           <w:sz w:val="30"/>
           <w:szCs w:val="30"/>
         </w:rPr>
+        <w:t xml:space="preserve">8-bis. Seguridad y cifrado de payload</w:t>
+      </w:r>
+    </w:p>
+    <w:p>
+      <w:pPr>
+        <w:spacing w:after="120"/>
+      </w:pPr>
+      <w:r>
+        <w:rPr>
+          <w:rFonts w:ascii="Arial" w:cs="Arial" w:eastAsia="Arial" w:hAnsi="Arial"/>
+          <w:sz w:val="22"/>
+          <w:szCs w:val="22"/>
+        </w:rPr>
+        <w:t xml:space="preserve">Controles aplicados (defensa en profundidad):</w:t>
+      </w:r>
+    </w:p>
+    <w:tbl>
+      <w:tblPr>
+        <w:tblW w:type="dxa" w:w="9360"/>
+        <w:tblBorders>
+          <w:top w:val="single" w:color="auto" w:sz="4"/>
+          <w:left w:val="single" w:color="auto" w:sz="4"/>
+          <w:bottom w:val="single" w:color="auto" w:sz="4"/>
+          <w:right w:val="single" w:color="auto" w:sz="4"/>
+          <w:insideH w:val="single" w:color="auto" w:sz="4"/>
+          <w:insideV w:val="single" w:color="auto" w:sz="4"/>
+        </w:tblBorders>
+      </w:tblPr>
+      <w:tblGrid>
+        <w:gridCol w:w="2800"/>
+        <w:gridCol w:w="6560"/>
+      </w:tblGrid>
+      <w:tr>
+        <w:trPr>
+          <w:tblHeader/>
+        </w:trPr>
+        <w:tc>
+          <w:tcPr>
+            <w:tcW w:type="dxa" w:w="2800"/>
+            <w:tcBorders>
+              <w:top w:val="single" w:color="B0B0B0" w:sz="1"/>
+              <w:left w:val="single" w:color="B0B0B0" w:sz="1"/>
+              <w:bottom w:val="single" w:color="B0B0B0" w:sz="1"/>
+              <w:right w:val="single" w:color="B0B0B0" w:sz="1"/>
+            </w:tcBorders>
+            <w:shd w:fill="002858" w:val="clear"/>
+            <w:tcMar>
+              <w:top w:type="dxa" w:w="80"/>
+              <w:left w:type="dxa" w:w="120"/>
+              <w:bottom w:type="dxa" w:w="80"/>
+              <w:right w:type="dxa" w:w="120"/>
+            </w:tcMar>
+          </w:tcPr>
+          <w:p>
+            <w:r>
+              <w:rPr>
+                <w:rFonts w:ascii="Arial" w:cs="Arial" w:eastAsia="Arial" w:hAnsi="Arial"/>
+                <w:b/>
+                <w:bCs/>
+                <w:color w:val="FFFFFF"/>
+                <w:sz w:val="20"/>
+                <w:szCs w:val="20"/>
+              </w:rPr>
+              <w:t xml:space="preserve">Control</w:t>
+            </w:r>
+          </w:p>
+        </w:tc>
+        <w:tc>
+          <w:tcPr>
+            <w:tcW w:type="dxa" w:w="6560"/>
+            <w:tcBorders>
+              <w:top w:val="single" w:color="B0B0B0" w:sz="1"/>
+              <w:left w:val="single" w:color="B0B0B0" w:sz="1"/>
+              <w:bottom w:val="single" w:color="B0B0B0" w:sz="1"/>
+              <w:right w:val="single" w:color="B0B0B0" w:sz="1"/>
+            </w:tcBorders>
+            <w:shd w:fill="002858" w:val="clear"/>
+            <w:tcMar>
+              <w:top w:type="dxa" w:w="80"/>
+              <w:left w:type="dxa" w:w="120"/>
+              <w:bottom w:type="dxa" w:w="80"/>
+              <w:right w:type="dxa" w:w="120"/>
+            </w:tcMar>
+          </w:tcPr>
+          <w:p>
+            <w:r>
+              <w:rPr>
+                <w:rFonts w:ascii="Arial" w:cs="Arial" w:eastAsia="Arial" w:hAnsi="Arial"/>
+                <w:b/>
+                <w:bCs/>
+                <w:color w:val="FFFFFF"/>
+                <w:sz w:val="20"/>
+                <w:szCs w:val="20"/>
+              </w:rPr>
+              <w:t xml:space="preserve">Implementación</w:t>
+            </w:r>
+          </w:p>
+        </w:tc>
+      </w:tr>
+      <w:tr>
+        <w:tc>
+          <w:tcPr>
+            <w:tcW w:type="dxa" w:w="2800"/>
+            <w:tcBorders>
+              <w:top w:val="single" w:color="B0B0B0" w:sz="1"/>
+              <w:left w:val="single" w:color="B0B0B0" w:sz="1"/>
+              <w:bottom w:val="single" w:color="B0B0B0" w:sz="1"/>
+              <w:right w:val="single" w:color="B0B0B0" w:sz="1"/>
+            </w:tcBorders>
+            <w:tcMar>
+              <w:top w:type="dxa" w:w="80"/>
+              <w:left w:type="dxa" w:w="120"/>
+              <w:bottom w:type="dxa" w:w="80"/>
+              <w:right w:type="dxa" w:w="120"/>
+            </w:tcMar>
+          </w:tcPr>
+          <w:p>
+            <w:r>
+              <w:rPr>
+                <w:rFonts w:ascii="Arial" w:cs="Arial" w:eastAsia="Arial" w:hAnsi="Arial"/>
+                <w:sz w:val="20"/>
+                <w:szCs w:val="20"/>
+              </w:rPr>
+              <w:t xml:space="preserve">Autenticación</w:t>
+            </w:r>
+          </w:p>
+        </w:tc>
+        <w:tc>
+          <w:tcPr>
+            <w:tcW w:type="dxa" w:w="6560"/>
+            <w:tcBorders>
+              <w:top w:val="single" w:color="B0B0B0" w:sz="1"/>
+              <w:left w:val="single" w:color="B0B0B0" w:sz="1"/>
+              <w:bottom w:val="single" w:color="B0B0B0" w:sz="1"/>
+              <w:right w:val="single" w:color="B0B0B0" w:sz="1"/>
+            </w:tcBorders>
+            <w:tcMar>
+              <w:top w:type="dxa" w:w="80"/>
+              <w:left w:type="dxa" w:w="120"/>
+              <w:bottom w:type="dxa" w:w="80"/>
+              <w:right w:type="dxa" w:w="120"/>
+            </w:tcMar>
+          </w:tcPr>
+          <w:p>
+            <w:r>
+              <w:rPr>
+                <w:rFonts w:ascii="Arial" w:cs="Arial" w:eastAsia="Arial" w:hAnsi="Arial"/>
+                <w:sz w:val="20"/>
+                <w:szCs w:val="20"/>
+              </w:rPr>
+              <w:t xml:space="preserve">JWT RS256, algoritmo fijado, TTL 12h; llaves en Secret Manager</w:t>
+            </w:r>
+          </w:p>
+        </w:tc>
+      </w:tr>
+      <w:tr>
+        <w:tc>
+          <w:tcPr>
+            <w:tcW w:type="dxa" w:w="2800"/>
+            <w:tcBorders>
+              <w:top w:val="single" w:color="B0B0B0" w:sz="1"/>
+              <w:left w:val="single" w:color="B0B0B0" w:sz="1"/>
+              <w:bottom w:val="single" w:color="B0B0B0" w:sz="1"/>
+              <w:right w:val="single" w:color="B0B0B0" w:sz="1"/>
+            </w:tcBorders>
+            <w:shd w:fill="F2F2F2" w:val="clear"/>
+            <w:tcMar>
+              <w:top w:type="dxa" w:w="80"/>
+              <w:left w:type="dxa" w:w="120"/>
+              <w:bottom w:type="dxa" w:w="80"/>
+              <w:right w:type="dxa" w:w="120"/>
+            </w:tcMar>
+          </w:tcPr>
+          <w:p>
+            <w:r>
+              <w:rPr>
+                <w:rFonts w:ascii="Arial" w:cs="Arial" w:eastAsia="Arial" w:hAnsi="Arial"/>
+                <w:sz w:val="20"/>
+                <w:szCs w:val="20"/>
+              </w:rPr>
+              <w:t xml:space="preserve">Autorización por país</w:t>
+            </w:r>
+          </w:p>
+        </w:tc>
+        <w:tc>
+          <w:tcPr>
+            <w:tcW w:type="dxa" w:w="6560"/>
+            <w:tcBorders>
+              <w:top w:val="single" w:color="B0B0B0" w:sz="1"/>
+              <w:left w:val="single" w:color="B0B0B0" w:sz="1"/>
+              <w:bottom w:val="single" w:color="B0B0B0" w:sz="1"/>
+              <w:right w:val="single" w:color="B0B0B0" w:sz="1"/>
+            </w:tcBorders>
+            <w:shd w:fill="F2F2F2" w:val="clear"/>
+            <w:tcMar>
+              <w:top w:type="dxa" w:w="80"/>
+              <w:left w:type="dxa" w:w="120"/>
+              <w:bottom w:type="dxa" w:w="80"/>
+              <w:right w:type="dxa" w:w="120"/>
+            </w:tcMar>
+          </w:tcPr>
+          <w:p>
+            <w:r>
+              <w:rPr>
+                <w:rFonts w:ascii="Arial" w:cs="Arial" w:eastAsia="Arial" w:hAnsi="Arial"/>
+                <w:sz w:val="20"/>
+                <w:szCs w:val="20"/>
+              </w:rPr>
+              <w:t xml:space="preserve">Guard valida el claim countries del token vs X-Country-Code → 403</w:t>
+            </w:r>
+          </w:p>
+        </w:tc>
+      </w:tr>
+      <w:tr>
+        <w:tc>
+          <w:tcPr>
+            <w:tcW w:type="dxa" w:w="2800"/>
+            <w:tcBorders>
+              <w:top w:val="single" w:color="B0B0B0" w:sz="1"/>
+              <w:left w:val="single" w:color="B0B0B0" w:sz="1"/>
+              <w:bottom w:val="single" w:color="B0B0B0" w:sz="1"/>
+              <w:right w:val="single" w:color="B0B0B0" w:sz="1"/>
+            </w:tcBorders>
+            <w:tcMar>
+              <w:top w:type="dxa" w:w="80"/>
+              <w:left w:type="dxa" w:w="120"/>
+              <w:bottom w:type="dxa" w:w="80"/>
+              <w:right w:type="dxa" w:w="120"/>
+            </w:tcMar>
+          </w:tcPr>
+          <w:p>
+            <w:r>
+              <w:rPr>
+                <w:rFonts w:ascii="Arial" w:cs="Arial" w:eastAsia="Arial" w:hAnsi="Arial"/>
+                <w:sz w:val="20"/>
+                <w:szCs w:val="20"/>
+              </w:rPr>
+              <w:t xml:space="preserve">Cifrado en tránsito</w:t>
+            </w:r>
+          </w:p>
+        </w:tc>
+        <w:tc>
+          <w:tcPr>
+            <w:tcW w:type="dxa" w:w="6560"/>
+            <w:tcBorders>
+              <w:top w:val="single" w:color="B0B0B0" w:sz="1"/>
+              <w:left w:val="single" w:color="B0B0B0" w:sz="1"/>
+              <w:bottom w:val="single" w:color="B0B0B0" w:sz="1"/>
+              <w:right w:val="single" w:color="B0B0B0" w:sz="1"/>
+            </w:tcBorders>
+            <w:tcMar>
+              <w:top w:type="dxa" w:w="80"/>
+              <w:left w:type="dxa" w:w="120"/>
+              <w:bottom w:type="dxa" w:w="80"/>
+              <w:right w:type="dxa" w:w="120"/>
+            </w:tcMar>
+          </w:tcPr>
+          <w:p>
+            <w:r>
+              <w:rPr>
+                <w:rFonts w:ascii="Arial" w:cs="Arial" w:eastAsia="Arial" w:hAnsi="Arial"/>
+                <w:sz w:val="20"/>
+                <w:szCs w:val="20"/>
+              </w:rPr>
+              <w:t xml:space="preserve">TLS terminado en Cloud Run + HSTS (helmet). Siempre detrás de TLS</w:t>
+            </w:r>
+          </w:p>
+        </w:tc>
+      </w:tr>
+      <w:tr>
+        <w:tc>
+          <w:tcPr>
+            <w:tcW w:type="dxa" w:w="2800"/>
+            <w:tcBorders>
+              <w:top w:val="single" w:color="B0B0B0" w:sz="1"/>
+              <w:left w:val="single" w:color="B0B0B0" w:sz="1"/>
+              <w:bottom w:val="single" w:color="B0B0B0" w:sz="1"/>
+              <w:right w:val="single" w:color="B0B0B0" w:sz="1"/>
+            </w:tcBorders>
+            <w:shd w:fill="F2F2F2" w:val="clear"/>
+            <w:tcMar>
+              <w:top w:type="dxa" w:w="80"/>
+              <w:left w:type="dxa" w:w="120"/>
+              <w:bottom w:type="dxa" w:w="80"/>
+              <w:right w:type="dxa" w:w="120"/>
+            </w:tcMar>
+          </w:tcPr>
+          <w:p>
+            <w:r>
+              <w:rPr>
+                <w:rFonts w:ascii="Arial" w:cs="Arial" w:eastAsia="Arial" w:hAnsi="Arial"/>
+                <w:sz w:val="20"/>
+                <w:szCs w:val="20"/>
+              </w:rPr>
+              <w:t xml:space="preserve">Cifrado de payload (P2C)</w:t>
+            </w:r>
+          </w:p>
+        </w:tc>
+        <w:tc>
+          <w:tcPr>
+            <w:tcW w:type="dxa" w:w="6560"/>
+            <w:tcBorders>
+              <w:top w:val="single" w:color="B0B0B0" w:sz="1"/>
+              <w:left w:val="single" w:color="B0B0B0" w:sz="1"/>
+              <w:bottom w:val="single" w:color="B0B0B0" w:sz="1"/>
+              <w:right w:val="single" w:color="B0B0B0" w:sz="1"/>
+            </w:tcBorders>
+            <w:shd w:fill="F2F2F2" w:val="clear"/>
+            <w:tcMar>
+              <w:top w:type="dxa" w:w="80"/>
+              <w:left w:type="dxa" w:w="120"/>
+              <w:bottom w:type="dxa" w:w="80"/>
+              <w:right w:type="dxa" w:w="120"/>
+            </w:tcMar>
+          </w:tcPr>
+          <w:p>
+            <w:r>
+              <w:rPr>
+                <w:rFonts w:ascii="Arial" w:cs="Arial" w:eastAsia="Arial" w:hAnsi="Arial"/>
+                <w:sz w:val="20"/>
+                <w:szCs w:val="20"/>
+              </w:rPr>
+              <w:t xml:space="preserve">CryptoJS.AES (librería crypto-js) — ver detalle abajo</w:t>
+            </w:r>
+          </w:p>
+        </w:tc>
+      </w:tr>
+      <w:tr>
+        <w:tc>
+          <w:tcPr>
+            <w:tcW w:type="dxa" w:w="2800"/>
+            <w:tcBorders>
+              <w:top w:val="single" w:color="B0B0B0" w:sz="1"/>
+              <w:left w:val="single" w:color="B0B0B0" w:sz="1"/>
+              <w:bottom w:val="single" w:color="B0B0B0" w:sz="1"/>
+              <w:right w:val="single" w:color="B0B0B0" w:sz="1"/>
+            </w:tcBorders>
+            <w:tcMar>
+              <w:top w:type="dxa" w:w="80"/>
+              <w:left w:type="dxa" w:w="120"/>
+              <w:bottom w:type="dxa" w:w="80"/>
+              <w:right w:type="dxa" w:w="120"/>
+            </w:tcMar>
+          </w:tcPr>
+          <w:p>
+            <w:r>
+              <w:rPr>
+                <w:rFonts w:ascii="Arial" w:cs="Arial" w:eastAsia="Arial" w:hAnsi="Arial"/>
+                <w:sz w:val="20"/>
+                <w:szCs w:val="20"/>
+              </w:rPr>
+              <w:t xml:space="preserve">Rate limiting</w:t>
+            </w:r>
+          </w:p>
+        </w:tc>
+        <w:tc>
+          <w:tcPr>
+            <w:tcW w:type="dxa" w:w="6560"/>
+            <w:tcBorders>
+              <w:top w:val="single" w:color="B0B0B0" w:sz="1"/>
+              <w:left w:val="single" w:color="B0B0B0" w:sz="1"/>
+              <w:bottom w:val="single" w:color="B0B0B0" w:sz="1"/>
+              <w:right w:val="single" w:color="B0B0B0" w:sz="1"/>
+            </w:tcBorders>
+            <w:tcMar>
+              <w:top w:type="dxa" w:w="80"/>
+              <w:left w:type="dxa" w:w="120"/>
+              <w:bottom w:type="dxa" w:w="80"/>
+              <w:right w:type="dxa" w:w="120"/>
+            </w:tcMar>
+          </w:tcPr>
+          <w:p>
+            <w:r>
+              <w:rPr>
+                <w:rFonts w:ascii="Arial" w:cs="Arial" w:eastAsia="Arial" w:hAnsi="Arial"/>
+                <w:sz w:val="20"/>
+                <w:szCs w:val="20"/>
+              </w:rPr>
+              <w:t xml:space="preserve">@nestjs/throttler: 60 req/min global, 10 req/min en /auth/token (429)</w:t>
+            </w:r>
+          </w:p>
+        </w:tc>
+      </w:tr>
+      <w:tr>
+        <w:tc>
+          <w:tcPr>
+            <w:tcW w:type="dxa" w:w="2800"/>
+            <w:tcBorders>
+              <w:top w:val="single" w:color="B0B0B0" w:sz="1"/>
+              <w:left w:val="single" w:color="B0B0B0" w:sz="1"/>
+              <w:bottom w:val="single" w:color="B0B0B0" w:sz="1"/>
+              <w:right w:val="single" w:color="B0B0B0" w:sz="1"/>
+            </w:tcBorders>
+            <w:shd w:fill="F2F2F2" w:val="clear"/>
+            <w:tcMar>
+              <w:top w:type="dxa" w:w="80"/>
+              <w:left w:type="dxa" w:w="120"/>
+              <w:bottom w:type="dxa" w:w="80"/>
+              <w:right w:type="dxa" w:w="120"/>
+            </w:tcMar>
+          </w:tcPr>
+          <w:p>
+            <w:r>
+              <w:rPr>
+                <w:rFonts w:ascii="Arial" w:cs="Arial" w:eastAsia="Arial" w:hAnsi="Arial"/>
+                <w:sz w:val="20"/>
+                <w:szCs w:val="20"/>
+              </w:rPr>
+              <w:t xml:space="preserve">CORS</w:t>
+            </w:r>
+          </w:p>
+        </w:tc>
+        <w:tc>
+          <w:tcPr>
+            <w:tcW w:type="dxa" w:w="6560"/>
+            <w:tcBorders>
+              <w:top w:val="single" w:color="B0B0B0" w:sz="1"/>
+              <w:left w:val="single" w:color="B0B0B0" w:sz="1"/>
+              <w:bottom w:val="single" w:color="B0B0B0" w:sz="1"/>
+              <w:right w:val="single" w:color="B0B0B0" w:sz="1"/>
+            </w:tcBorders>
+            <w:shd w:fill="F2F2F2" w:val="clear"/>
+            <w:tcMar>
+              <w:top w:type="dxa" w:w="80"/>
+              <w:left w:type="dxa" w:w="120"/>
+              <w:bottom w:type="dxa" w:w="80"/>
+              <w:right w:type="dxa" w:w="120"/>
+            </w:tcMar>
+          </w:tcPr>
+          <w:p>
+            <w:r>
+              <w:rPr>
+                <w:rFonts w:ascii="Arial" w:cs="Arial" w:eastAsia="Arial" w:hAnsi="Arial"/>
+                <w:sz w:val="20"/>
+                <w:szCs w:val="20"/>
+              </w:rPr>
+              <w:t xml:space="preserve">Allowlist por CORS_ORIGINS (ej. https://mi-portal.farmatodo.com)</w:t>
+            </w:r>
+          </w:p>
+        </w:tc>
+      </w:tr>
+      <w:tr>
+        <w:tc>
+          <w:tcPr>
+            <w:tcW w:type="dxa" w:w="2800"/>
+            <w:tcBorders>
+              <w:top w:val="single" w:color="B0B0B0" w:sz="1"/>
+              <w:left w:val="single" w:color="B0B0B0" w:sz="1"/>
+              <w:bottom w:val="single" w:color="B0B0B0" w:sz="1"/>
+              <w:right w:val="single" w:color="B0B0B0" w:sz="1"/>
+            </w:tcBorders>
+            <w:tcMar>
+              <w:top w:type="dxa" w:w="80"/>
+              <w:left w:type="dxa" w:w="120"/>
+              <w:bottom w:type="dxa" w:w="80"/>
+              <w:right w:type="dxa" w:w="120"/>
+            </w:tcMar>
+          </w:tcPr>
+          <w:p>
+            <w:r>
+              <w:rPr>
+                <w:rFonts w:ascii="Arial" w:cs="Arial" w:eastAsia="Arial" w:hAnsi="Arial"/>
+                <w:sz w:val="20"/>
+                <w:szCs w:val="20"/>
+              </w:rPr>
+              <w:t xml:space="preserve">Credenciales de cliente</w:t>
+            </w:r>
+          </w:p>
+        </w:tc>
+        <w:tc>
+          <w:tcPr>
+            <w:tcW w:type="dxa" w:w="6560"/>
+            <w:tcBorders>
+              <w:top w:val="single" w:color="B0B0B0" w:sz="1"/>
+              <w:left w:val="single" w:color="B0B0B0" w:sz="1"/>
+              <w:bottom w:val="single" w:color="B0B0B0" w:sz="1"/>
+              <w:right w:val="single" w:color="B0B0B0" w:sz="1"/>
+            </w:tcBorders>
+            <w:tcMar>
+              <w:top w:type="dxa" w:w="80"/>
+              <w:left w:type="dxa" w:w="120"/>
+              <w:bottom w:type="dxa" w:w="80"/>
+              <w:right w:type="dxa" w:w="120"/>
+            </w:tcMar>
+          </w:tcPr>
+          <w:p>
+            <w:r>
+              <w:rPr>
+                <w:rFonts w:ascii="Arial" w:cs="Arial" w:eastAsia="Arial" w:hAnsi="Arial"/>
+                <w:sz w:val="20"/>
+                <w:szCs w:val="20"/>
+              </w:rPr>
+              <w:t xml:space="preserve">Hash SHA-256, comparación en tiempo constante (timingSafeEqual)</w:t>
+            </w:r>
+          </w:p>
+        </w:tc>
+      </w:tr>
+      <w:tr>
+        <w:tc>
+          <w:tcPr>
+            <w:tcW w:type="dxa" w:w="2800"/>
+            <w:tcBorders>
+              <w:top w:val="single" w:color="B0B0B0" w:sz="1"/>
+              <w:left w:val="single" w:color="B0B0B0" w:sz="1"/>
+              <w:bottom w:val="single" w:color="B0B0B0" w:sz="1"/>
+              <w:right w:val="single" w:color="B0B0B0" w:sz="1"/>
+            </w:tcBorders>
+            <w:shd w:fill="F2F2F2" w:val="clear"/>
+            <w:tcMar>
+              <w:top w:type="dxa" w:w="80"/>
+              <w:left w:type="dxa" w:w="120"/>
+              <w:bottom w:type="dxa" w:w="80"/>
+              <w:right w:type="dxa" w:w="120"/>
+            </w:tcMar>
+          </w:tcPr>
+          <w:p>
+            <w:r>
+              <w:rPr>
+                <w:rFonts w:ascii="Arial" w:cs="Arial" w:eastAsia="Arial" w:hAnsi="Arial"/>
+                <w:sz w:val="20"/>
+                <w:szCs w:val="20"/>
+              </w:rPr>
+              <w:t xml:space="preserve">Superficie</w:t>
+            </w:r>
+          </w:p>
+        </w:tc>
+        <w:tc>
+          <w:tcPr>
+            <w:tcW w:type="dxa" w:w="6560"/>
+            <w:tcBorders>
+              <w:top w:val="single" w:color="B0B0B0" w:sz="1"/>
+              <w:left w:val="single" w:color="B0B0B0" w:sz="1"/>
+              <w:bottom w:val="single" w:color="B0B0B0" w:sz="1"/>
+              <w:right w:val="single" w:color="B0B0B0" w:sz="1"/>
+            </w:tcBorders>
+            <w:shd w:fill="F2F2F2" w:val="clear"/>
+            <w:tcMar>
+              <w:top w:type="dxa" w:w="80"/>
+              <w:left w:type="dxa" w:w="120"/>
+              <w:bottom w:type="dxa" w:w="80"/>
+              <w:right w:type="dxa" w:w="120"/>
+            </w:tcMar>
+          </w:tcPr>
+          <w:p>
+            <w:r>
+              <w:rPr>
+                <w:rFonts w:ascii="Arial" w:cs="Arial" w:eastAsia="Arial" w:hAnsi="Arial"/>
+                <w:sz w:val="20"/>
+                <w:szCs w:val="20"/>
+              </w:rPr>
+              <w:t xml:space="preserve">Swagger /docs deshabilitado en producción</w:t>
+            </w:r>
+          </w:p>
+        </w:tc>
+      </w:tr>
+      <w:tr>
+        <w:tc>
+          <w:tcPr>
+            <w:tcW w:type="dxa" w:w="2800"/>
+            <w:tcBorders>
+              <w:top w:val="single" w:color="B0B0B0" w:sz="1"/>
+              <w:left w:val="single" w:color="B0B0B0" w:sz="1"/>
+              <w:bottom w:val="single" w:color="B0B0B0" w:sz="1"/>
+              <w:right w:val="single" w:color="B0B0B0" w:sz="1"/>
+            </w:tcBorders>
+            <w:tcMar>
+              <w:top w:type="dxa" w:w="80"/>
+              <w:left w:type="dxa" w:w="120"/>
+              <w:bottom w:type="dxa" w:w="80"/>
+              <w:right w:type="dxa" w:w="120"/>
+            </w:tcMar>
+          </w:tcPr>
+          <w:p>
+            <w:r>
+              <w:rPr>
+                <w:rFonts w:ascii="Arial" w:cs="Arial" w:eastAsia="Arial" w:hAnsi="Arial"/>
+                <w:sz w:val="20"/>
+                <w:szCs w:val="20"/>
+              </w:rPr>
+              <w:t xml:space="preserve">Validación / SQLi</w:t>
+            </w:r>
+          </w:p>
+        </w:tc>
+        <w:tc>
+          <w:tcPr>
+            <w:tcW w:type="dxa" w:w="6560"/>
+            <w:tcBorders>
+              <w:top w:val="single" w:color="B0B0B0" w:sz="1"/>
+              <w:left w:val="single" w:color="B0B0B0" w:sz="1"/>
+              <w:bottom w:val="single" w:color="B0B0B0" w:sz="1"/>
+              <w:right w:val="single" w:color="B0B0B0" w:sz="1"/>
+            </w:tcBorders>
+            <w:tcMar>
+              <w:top w:type="dxa" w:w="80"/>
+              <w:left w:type="dxa" w:w="120"/>
+              <w:bottom w:type="dxa" w:w="80"/>
+              <w:right w:type="dxa" w:w="120"/>
+            </w:tcMar>
+          </w:tcPr>
+          <w:p>
+            <w:r>
+              <w:rPr>
+                <w:rFonts w:ascii="Arial" w:cs="Arial" w:eastAsia="Arial" w:hAnsi="Arial"/>
+                <w:sz w:val="20"/>
+                <w:szCs w:val="20"/>
+              </w:rPr>
+              <w:t xml:space="preserve">class-validator (whitelist); PKG parametriza con JSON_TABLE</w:t>
+            </w:r>
+          </w:p>
+        </w:tc>
+      </w:tr>
+    </w:tbl>
+    <w:p>
+      <w:pPr>
+        <w:spacing w:after="120"/>
+      </w:pPr>
+    </w:p>
+    <w:p>
+      <w:pPr>
+        <w:spacing w:after="120"/>
+        <w:rPr>
+          <w:b/>
+          <w:bCs/>
+        </w:rPr>
+      </w:pPr>
+      <w:r>
+        <w:rPr>
+          <w:rFonts w:ascii="Arial" w:cs="Arial" w:eastAsia="Arial" w:hAnsi="Arial"/>
+          <w:b/>
+          <w:bCs/>
+          <w:sz w:val="22"/>
+          <w:szCs w:val="22"/>
+        </w:rPr>
+        <w:t xml:space="preserve">Cifrado de payload (compatible con el front Farmatodo):</w:t>
+      </w:r>
+    </w:p>
+    <w:p>
+      <w:pPr>
+        <w:pStyle w:val="ListParagraph"/>
+        <w:numPr>
+          <w:ilvl w:val="0"/>
+          <w:numId w:val="2"/>
+        </w:numPr>
+        <w:spacing w:after="80"/>
+      </w:pPr>
+      <w:r>
+        <w:rPr>
+          <w:rFonts w:ascii="Arial" w:cs="Arial" w:eastAsia="Arial" w:hAnsi="Arial"/>
+          <w:sz w:val="22"/>
+          <w:szCs w:val="22"/>
+        </w:rPr>
+        <w:t xml:space="preserve">Librería crypto-js (misma que el portal): CryptoJS.AES.encrypt(JSON.stringify(data), KEY) → base64 con prefijo Salted__ (AES-CBC + KDF por passphrase).</w:t>
+      </w:r>
+    </w:p>
+    <w:p>
+      <w:pPr>
+        <w:pStyle w:val="ListParagraph"/>
+        <w:numPr>
+          <w:ilvl w:val="0"/>
+          <w:numId w:val="2"/>
+        </w:numPr>
+        <w:spacing w:after="80"/>
+      </w:pPr>
+      <w:r>
+        <w:rPr>
+          <w:rFonts w:ascii="Arial" w:cs="Arial" w:eastAsia="Arial" w:hAnsi="Arial"/>
+          <w:sz w:val="22"/>
+          <w:szCs w:val="22"/>
+        </w:rPr>
+        <w:t xml:space="preserve">Request: el front envía el campo RequestJson cifrado; el PayloadCryptoInterceptor lo descifra ANTES de la validación (los DTOs operan sobre el JSON en claro).</w:t>
+      </w:r>
+    </w:p>
+    <w:p>
+      <w:pPr>
+        <w:pStyle w:val="ListParagraph"/>
+        <w:numPr>
+          <w:ilvl w:val="0"/>
+          <w:numId w:val="2"/>
+        </w:numPr>
+        <w:spacing w:after="80"/>
+      </w:pPr>
+      <w:r>
+        <w:rPr>
+          <w:rFonts w:ascii="Arial" w:cs="Arial" w:eastAsia="Arial" w:hAnsi="Arial"/>
+          <w:sz w:val="22"/>
+          <w:szCs w:val="22"/>
+        </w:rPr>
+        <w:t xml:space="preserve">Response: cuando el request llegó cifrado, la respuesta se devuelve como ResponseJson cifrado con la misma passphrase.</w:t>
+      </w:r>
+    </w:p>
+    <w:p>
+      <w:pPr>
+        <w:pStyle w:val="ListParagraph"/>
+        <w:numPr>
+          <w:ilvl w:val="0"/>
+          <w:numId w:val="2"/>
+        </w:numPr>
+        <w:spacing w:after="80"/>
+      </w:pPr>
+      <w:r>
+        <w:rPr>
+          <w:rFonts w:ascii="Arial" w:cs="Arial" w:eastAsia="Arial" w:hAnsi="Arial"/>
+          <w:sz w:val="22"/>
+          <w:szCs w:val="22"/>
+        </w:rPr>
+        <w:t xml:space="preserve">Llave: passphrase compartida en PAYLOAD_ENCRYPTION_KEY (Secret Manager). Vacía = deshabilitado; los requests en claro siguen funcionando. Payload cifrado inválido → 400.</w:t>
+      </w:r>
+    </w:p>
+    <w:p>
+      <w:pPr>
+        <w:shd w:fill="1E1E2E" w:val="clear"/>
+        <w:spacing w:after="0"/>
+        <w:ind w:left="200"/>
+      </w:pPr>
+      <w:r>
+        <w:rPr>
+          <w:rFonts w:ascii="Consolas" w:cs="Consolas" w:eastAsia="Consolas" w:hAnsi="Consolas"/>
+          <w:color w:val="E6E6E6"/>
+          <w:sz w:val="18"/>
+          <w:szCs w:val="18"/>
+        </w:rPr>
+        <w:t xml:space="preserve">Front (crypto-js)                 employee-api-spi</w:t>
+      </w:r>
+    </w:p>
+    <w:p>
+      <w:pPr>
+        <w:shd w:fill="1E1E2E" w:val="clear"/>
+        <w:spacing w:after="0"/>
+        <w:ind w:left="200"/>
+      </w:pPr>
+      <w:r>
+        <w:rPr>
+          <w:rFonts w:ascii="Consolas" w:cs="Consolas" w:eastAsia="Consolas" w:hAnsi="Consolas"/>
+          <w:color w:val="E6E6E6"/>
+          <w:sz w:val="18"/>
+          <w:szCs w:val="18"/>
+        </w:rPr>
+        <w:t xml:space="preserve">  data -&gt; CryptoJS.AES.encrypt --&gt; RequestJson (cifrado)</w:t>
+      </w:r>
+    </w:p>
+    <w:p>
+      <w:pPr>
+        <w:shd w:fill="1E1E2E" w:val="clear"/>
+        <w:spacing w:after="0"/>
+        <w:ind w:left="200"/>
+      </w:pPr>
+      <w:r>
+        <w:rPr>
+          <w:rFonts w:ascii="Consolas" w:cs="Consolas" w:eastAsia="Consolas" w:hAnsi="Consolas"/>
+          <w:color w:val="E6E6E6"/>
+          <w:sz w:val="18"/>
+          <w:szCs w:val="18"/>
+        </w:rPr>
+        <w:t xml:space="preserve">                                   -&gt; interceptor descifra -&gt; DTO valida -&gt; PKG</w:t>
+      </w:r>
+    </w:p>
+    <w:p>
+      <w:pPr>
+        <w:shd w:fill="1E1E2E" w:val="clear"/>
+        <w:spacing w:after="0"/>
+        <w:ind w:left="200"/>
+      </w:pPr>
+      <w:r>
+        <w:rPr>
+          <w:rFonts w:ascii="Consolas" w:cs="Consolas" w:eastAsia="Consolas" w:hAnsi="Consolas"/>
+          <w:color w:val="E6E6E6"/>
+          <w:sz w:val="18"/>
+          <w:szCs w:val="18"/>
+        </w:rPr>
+        <w:t xml:space="preserve">  CryptoJS.AES.decrypt &lt;---------- ResponseJson (cifrado) &lt;- interceptor cifra</w:t>
+      </w:r>
+    </w:p>
+    <w:p>
+      <w:pPr>
+        <w:pStyle w:val="Heading1"/>
+        <w:spacing w:after="160" w:before="280"/>
+      </w:pPr>
+      <w:r>
+        <w:rPr>
+          <w:rFonts w:ascii="Arial" w:cs="Arial" w:eastAsia="Arial" w:hAnsi="Arial"/>
+          <w:b/>
+          <w:bCs/>
+          <w:color w:val="002858"/>
+          <w:sz w:val="30"/>
+          <w:szCs w:val="30"/>
+        </w:rPr>
         <w:t xml:space="preserve">9. Flujos asíncronos / continuidad</w:t>
       </w:r>
     </w:p>
@@ -6247,7 +7033,734 @@
           <w:sz w:val="30"/>
           <w:szCs w:val="30"/>
         </w:rPr>
-        <w:t xml:space="preserve">12. Conclusión</w:t>
+        <w:t xml:space="preserve">13. Stack y librerías</w:t>
+      </w:r>
+    </w:p>
+    <w:tbl>
+      <w:tblPr>
+        <w:tblW w:type="dxa" w:w="9360"/>
+        <w:tblBorders>
+          <w:top w:val="single" w:color="auto" w:sz="4"/>
+          <w:left w:val="single" w:color="auto" w:sz="4"/>
+          <w:bottom w:val="single" w:color="auto" w:sz="4"/>
+          <w:right w:val="single" w:color="auto" w:sz="4"/>
+          <w:insideH w:val="single" w:color="auto" w:sz="4"/>
+          <w:insideV w:val="single" w:color="auto" w:sz="4"/>
+        </w:tblBorders>
+      </w:tblPr>
+      <w:tblGrid>
+        <w:gridCol w:w="3000"/>
+        <w:gridCol w:w="6360"/>
+      </w:tblGrid>
+      <w:tr>
+        <w:trPr>
+          <w:tblHeader/>
+        </w:trPr>
+        <w:tc>
+          <w:tcPr>
+            <w:tcW w:type="dxa" w:w="3000"/>
+            <w:tcBorders>
+              <w:top w:val="single" w:color="B0B0B0" w:sz="1"/>
+              <w:left w:val="single" w:color="B0B0B0" w:sz="1"/>
+              <w:bottom w:val="single" w:color="B0B0B0" w:sz="1"/>
+              <w:right w:val="single" w:color="B0B0B0" w:sz="1"/>
+            </w:tcBorders>
+            <w:shd w:fill="002858" w:val="clear"/>
+            <w:tcMar>
+              <w:top w:type="dxa" w:w="80"/>
+              <w:left w:type="dxa" w:w="120"/>
+              <w:bottom w:type="dxa" w:w="80"/>
+              <w:right w:type="dxa" w:w="120"/>
+            </w:tcMar>
+          </w:tcPr>
+          <w:p>
+            <w:r>
+              <w:rPr>
+                <w:rFonts w:ascii="Arial" w:cs="Arial" w:eastAsia="Arial" w:hAnsi="Arial"/>
+                <w:b/>
+                <w:bCs/>
+                <w:color w:val="FFFFFF"/>
+                <w:sz w:val="20"/>
+                <w:szCs w:val="20"/>
+              </w:rPr>
+              <w:t xml:space="preserve">Propósito</w:t>
+            </w:r>
+          </w:p>
+        </w:tc>
+        <w:tc>
+          <w:tcPr>
+            <w:tcW w:type="dxa" w:w="6360"/>
+            <w:tcBorders>
+              <w:top w:val="single" w:color="B0B0B0" w:sz="1"/>
+              <w:left w:val="single" w:color="B0B0B0" w:sz="1"/>
+              <w:bottom w:val="single" w:color="B0B0B0" w:sz="1"/>
+              <w:right w:val="single" w:color="B0B0B0" w:sz="1"/>
+            </w:tcBorders>
+            <w:shd w:fill="002858" w:val="clear"/>
+            <w:tcMar>
+              <w:top w:type="dxa" w:w="80"/>
+              <w:left w:type="dxa" w:w="120"/>
+              <w:bottom w:type="dxa" w:w="80"/>
+              <w:right w:type="dxa" w:w="120"/>
+            </w:tcMar>
+          </w:tcPr>
+          <w:p>
+            <w:r>
+              <w:rPr>
+                <w:rFonts w:ascii="Arial" w:cs="Arial" w:eastAsia="Arial" w:hAnsi="Arial"/>
+                <w:b/>
+                <w:bCs/>
+                <w:color w:val="FFFFFF"/>
+                <w:sz w:val="20"/>
+                <w:szCs w:val="20"/>
+              </w:rPr>
+              <w:t xml:space="preserve">Librería / Tecnología</w:t>
+            </w:r>
+          </w:p>
+        </w:tc>
+      </w:tr>
+      <w:tr>
+        <w:tc>
+          <w:tcPr>
+            <w:tcW w:type="dxa" w:w="3000"/>
+            <w:tcBorders>
+              <w:top w:val="single" w:color="B0B0B0" w:sz="1"/>
+              <w:left w:val="single" w:color="B0B0B0" w:sz="1"/>
+              <w:bottom w:val="single" w:color="B0B0B0" w:sz="1"/>
+              <w:right w:val="single" w:color="B0B0B0" w:sz="1"/>
+            </w:tcBorders>
+            <w:tcMar>
+              <w:top w:type="dxa" w:w="80"/>
+              <w:left w:type="dxa" w:w="120"/>
+              <w:bottom w:type="dxa" w:w="80"/>
+              <w:right w:type="dxa" w:w="120"/>
+            </w:tcMar>
+          </w:tcPr>
+          <w:p>
+            <w:r>
+              <w:rPr>
+                <w:rFonts w:ascii="Arial" w:cs="Arial" w:eastAsia="Arial" w:hAnsi="Arial"/>
+                <w:sz w:val="20"/>
+                <w:szCs w:val="20"/>
+              </w:rPr>
+              <w:t xml:space="preserve">Runtime / framework</w:t>
+            </w:r>
+          </w:p>
+        </w:tc>
+        <w:tc>
+          <w:tcPr>
+            <w:tcW w:type="dxa" w:w="6360"/>
+            <w:tcBorders>
+              <w:top w:val="single" w:color="B0B0B0" w:sz="1"/>
+              <w:left w:val="single" w:color="B0B0B0" w:sz="1"/>
+              <w:bottom w:val="single" w:color="B0B0B0" w:sz="1"/>
+              <w:right w:val="single" w:color="B0B0B0" w:sz="1"/>
+            </w:tcBorders>
+            <w:tcMar>
+              <w:top w:type="dxa" w:w="80"/>
+              <w:left w:type="dxa" w:w="120"/>
+              <w:bottom w:type="dxa" w:w="80"/>
+              <w:right w:type="dxa" w:w="120"/>
+            </w:tcMar>
+          </w:tcPr>
+          <w:p>
+            <w:r>
+              <w:rPr>
+                <w:rFonts w:ascii="Arial" w:cs="Arial" w:eastAsia="Arial" w:hAnsi="Arial"/>
+                <w:sz w:val="20"/>
+                <w:szCs w:val="20"/>
+              </w:rPr>
+              <w:t xml:space="preserve">Node 20 LTS · NestJS 10 · TypeScript</w:t>
+            </w:r>
+          </w:p>
+        </w:tc>
+      </w:tr>
+      <w:tr>
+        <w:tc>
+          <w:tcPr>
+            <w:tcW w:type="dxa" w:w="3000"/>
+            <w:tcBorders>
+              <w:top w:val="single" w:color="B0B0B0" w:sz="1"/>
+              <w:left w:val="single" w:color="B0B0B0" w:sz="1"/>
+              <w:bottom w:val="single" w:color="B0B0B0" w:sz="1"/>
+              <w:right w:val="single" w:color="B0B0B0" w:sz="1"/>
+            </w:tcBorders>
+            <w:shd w:fill="F2F2F2" w:val="clear"/>
+            <w:tcMar>
+              <w:top w:type="dxa" w:w="80"/>
+              <w:left w:type="dxa" w:w="120"/>
+              <w:bottom w:type="dxa" w:w="80"/>
+              <w:right w:type="dxa" w:w="120"/>
+            </w:tcMar>
+          </w:tcPr>
+          <w:p>
+            <w:r>
+              <w:rPr>
+                <w:rFonts w:ascii="Arial" w:cs="Arial" w:eastAsia="Arial" w:hAnsi="Arial"/>
+                <w:sz w:val="20"/>
+                <w:szCs w:val="20"/>
+              </w:rPr>
+              <w:t xml:space="preserve">Oracle</w:t>
+            </w:r>
+          </w:p>
+        </w:tc>
+        <w:tc>
+          <w:tcPr>
+            <w:tcW w:type="dxa" w:w="6360"/>
+            <w:tcBorders>
+              <w:top w:val="single" w:color="B0B0B0" w:sz="1"/>
+              <w:left w:val="single" w:color="B0B0B0" w:sz="1"/>
+              <w:bottom w:val="single" w:color="B0B0B0" w:sz="1"/>
+              <w:right w:val="single" w:color="B0B0B0" w:sz="1"/>
+            </w:tcBorders>
+            <w:shd w:fill="F2F2F2" w:val="clear"/>
+            <w:tcMar>
+              <w:top w:type="dxa" w:w="80"/>
+              <w:left w:type="dxa" w:w="120"/>
+              <w:bottom w:type="dxa" w:w="80"/>
+              <w:right w:type="dxa" w:w="120"/>
+            </w:tcMar>
+          </w:tcPr>
+          <w:p>
+            <w:r>
+              <w:rPr>
+                <w:rFonts w:ascii="Arial" w:cs="Arial" w:eastAsia="Arial" w:hAnsi="Arial"/>
+                <w:sz w:val="20"/>
+                <w:szCs w:val="20"/>
+              </w:rPr>
+              <w:t xml:space="preserve">oracledb (thin mode)</w:t>
+            </w:r>
+          </w:p>
+        </w:tc>
+      </w:tr>
+      <w:tr>
+        <w:tc>
+          <w:tcPr>
+            <w:tcW w:type="dxa" w:w="3000"/>
+            <w:tcBorders>
+              <w:top w:val="single" w:color="B0B0B0" w:sz="1"/>
+              <w:left w:val="single" w:color="B0B0B0" w:sz="1"/>
+              <w:bottom w:val="single" w:color="B0B0B0" w:sz="1"/>
+              <w:right w:val="single" w:color="B0B0B0" w:sz="1"/>
+            </w:tcBorders>
+            <w:tcMar>
+              <w:top w:type="dxa" w:w="80"/>
+              <w:left w:type="dxa" w:w="120"/>
+              <w:bottom w:type="dxa" w:w="80"/>
+              <w:right w:type="dxa" w:w="120"/>
+            </w:tcMar>
+          </w:tcPr>
+          <w:p>
+            <w:r>
+              <w:rPr>
+                <w:rFonts w:ascii="Arial" w:cs="Arial" w:eastAsia="Arial" w:hAnsi="Arial"/>
+                <w:sz w:val="20"/>
+                <w:szCs w:val="20"/>
+              </w:rPr>
+              <w:t xml:space="preserve">Autenticación JWT</w:t>
+            </w:r>
+          </w:p>
+        </w:tc>
+        <w:tc>
+          <w:tcPr>
+            <w:tcW w:type="dxa" w:w="6360"/>
+            <w:tcBorders>
+              <w:top w:val="single" w:color="B0B0B0" w:sz="1"/>
+              <w:left w:val="single" w:color="B0B0B0" w:sz="1"/>
+              <w:bottom w:val="single" w:color="B0B0B0" w:sz="1"/>
+              <w:right w:val="single" w:color="B0B0B0" w:sz="1"/>
+            </w:tcBorders>
+            <w:tcMar>
+              <w:top w:type="dxa" w:w="80"/>
+              <w:left w:type="dxa" w:w="120"/>
+              <w:bottom w:type="dxa" w:w="80"/>
+              <w:right w:type="dxa" w:w="120"/>
+            </w:tcMar>
+          </w:tcPr>
+          <w:p>
+            <w:r>
+              <w:rPr>
+                <w:rFonts w:ascii="Arial" w:cs="Arial" w:eastAsia="Arial" w:hAnsi="Arial"/>
+                <w:sz w:val="20"/>
+                <w:szCs w:val="20"/>
+              </w:rPr>
+              <w:t xml:space="preserve">@nestjs/passport · passport-jwt · jsonwebtoken (RS256)</w:t>
+            </w:r>
+          </w:p>
+        </w:tc>
+      </w:tr>
+      <w:tr>
+        <w:tc>
+          <w:tcPr>
+            <w:tcW w:type="dxa" w:w="3000"/>
+            <w:tcBorders>
+              <w:top w:val="single" w:color="B0B0B0" w:sz="1"/>
+              <w:left w:val="single" w:color="B0B0B0" w:sz="1"/>
+              <w:bottom w:val="single" w:color="B0B0B0" w:sz="1"/>
+              <w:right w:val="single" w:color="B0B0B0" w:sz="1"/>
+            </w:tcBorders>
+            <w:shd w:fill="F2F2F2" w:val="clear"/>
+            <w:tcMar>
+              <w:top w:type="dxa" w:w="80"/>
+              <w:left w:type="dxa" w:w="120"/>
+              <w:bottom w:type="dxa" w:w="80"/>
+              <w:right w:type="dxa" w:w="120"/>
+            </w:tcMar>
+          </w:tcPr>
+          <w:p>
+            <w:r>
+              <w:rPr>
+                <w:rFonts w:ascii="Arial" w:cs="Arial" w:eastAsia="Arial" w:hAnsi="Arial"/>
+                <w:sz w:val="20"/>
+                <w:szCs w:val="20"/>
+              </w:rPr>
+              <w:t xml:space="preserve">Cifrado de payload</w:t>
+            </w:r>
+          </w:p>
+        </w:tc>
+        <w:tc>
+          <w:tcPr>
+            <w:tcW w:type="dxa" w:w="6360"/>
+            <w:tcBorders>
+              <w:top w:val="single" w:color="B0B0B0" w:sz="1"/>
+              <w:left w:val="single" w:color="B0B0B0" w:sz="1"/>
+              <w:bottom w:val="single" w:color="B0B0B0" w:sz="1"/>
+              <w:right w:val="single" w:color="B0B0B0" w:sz="1"/>
+            </w:tcBorders>
+            <w:shd w:fill="F2F2F2" w:val="clear"/>
+            <w:tcMar>
+              <w:top w:type="dxa" w:w="80"/>
+              <w:left w:type="dxa" w:w="120"/>
+              <w:bottom w:type="dxa" w:w="80"/>
+              <w:right w:type="dxa" w:w="120"/>
+            </w:tcMar>
+          </w:tcPr>
+          <w:p>
+            <w:r>
+              <w:rPr>
+                <w:rFonts w:ascii="Arial" w:cs="Arial" w:eastAsia="Arial" w:hAnsi="Arial"/>
+                <w:sz w:val="20"/>
+                <w:szCs w:val="20"/>
+              </w:rPr>
+              <w:t xml:space="preserve">crypto-js (CryptoJS.AES, compatible con el front)</w:t>
+            </w:r>
+          </w:p>
+        </w:tc>
+      </w:tr>
+      <w:tr>
+        <w:tc>
+          <w:tcPr>
+            <w:tcW w:type="dxa" w:w="3000"/>
+            <w:tcBorders>
+              <w:top w:val="single" w:color="B0B0B0" w:sz="1"/>
+              <w:left w:val="single" w:color="B0B0B0" w:sz="1"/>
+              <w:bottom w:val="single" w:color="B0B0B0" w:sz="1"/>
+              <w:right w:val="single" w:color="B0B0B0" w:sz="1"/>
+            </w:tcBorders>
+            <w:tcMar>
+              <w:top w:type="dxa" w:w="80"/>
+              <w:left w:type="dxa" w:w="120"/>
+              <w:bottom w:type="dxa" w:w="80"/>
+              <w:right w:type="dxa" w:w="120"/>
+            </w:tcMar>
+          </w:tcPr>
+          <w:p>
+            <w:r>
+              <w:rPr>
+                <w:rFonts w:ascii="Arial" w:cs="Arial" w:eastAsia="Arial" w:hAnsi="Arial"/>
+                <w:sz w:val="20"/>
+                <w:szCs w:val="20"/>
+              </w:rPr>
+              <w:t xml:space="preserve">Rate limiting</w:t>
+            </w:r>
+          </w:p>
+        </w:tc>
+        <w:tc>
+          <w:tcPr>
+            <w:tcW w:type="dxa" w:w="6360"/>
+            <w:tcBorders>
+              <w:top w:val="single" w:color="B0B0B0" w:sz="1"/>
+              <w:left w:val="single" w:color="B0B0B0" w:sz="1"/>
+              <w:bottom w:val="single" w:color="B0B0B0" w:sz="1"/>
+              <w:right w:val="single" w:color="B0B0B0" w:sz="1"/>
+            </w:tcBorders>
+            <w:tcMar>
+              <w:top w:type="dxa" w:w="80"/>
+              <w:left w:type="dxa" w:w="120"/>
+              <w:bottom w:type="dxa" w:w="80"/>
+              <w:right w:type="dxa" w:w="120"/>
+            </w:tcMar>
+          </w:tcPr>
+          <w:p>
+            <w:r>
+              <w:rPr>
+                <w:rFonts w:ascii="Arial" w:cs="Arial" w:eastAsia="Arial" w:hAnsi="Arial"/>
+                <w:sz w:val="20"/>
+                <w:szCs w:val="20"/>
+              </w:rPr>
+              <w:t xml:space="preserve">@nestjs/throttler</w:t>
+            </w:r>
+          </w:p>
+        </w:tc>
+      </w:tr>
+      <w:tr>
+        <w:tc>
+          <w:tcPr>
+            <w:tcW w:type="dxa" w:w="3000"/>
+            <w:tcBorders>
+              <w:top w:val="single" w:color="B0B0B0" w:sz="1"/>
+              <w:left w:val="single" w:color="B0B0B0" w:sz="1"/>
+              <w:bottom w:val="single" w:color="B0B0B0" w:sz="1"/>
+              <w:right w:val="single" w:color="B0B0B0" w:sz="1"/>
+            </w:tcBorders>
+            <w:shd w:fill="F2F2F2" w:val="clear"/>
+            <w:tcMar>
+              <w:top w:type="dxa" w:w="80"/>
+              <w:left w:type="dxa" w:w="120"/>
+              <w:bottom w:type="dxa" w:w="80"/>
+              <w:right w:type="dxa" w:w="120"/>
+            </w:tcMar>
+          </w:tcPr>
+          <w:p>
+            <w:r>
+              <w:rPr>
+                <w:rFonts w:ascii="Arial" w:cs="Arial" w:eastAsia="Arial" w:hAnsi="Arial"/>
+                <w:sz w:val="20"/>
+                <w:szCs w:val="20"/>
+              </w:rPr>
+              <w:t xml:space="preserve">Cabeceras de seguridad</w:t>
+            </w:r>
+          </w:p>
+        </w:tc>
+        <w:tc>
+          <w:tcPr>
+            <w:tcW w:type="dxa" w:w="6360"/>
+            <w:tcBorders>
+              <w:top w:val="single" w:color="B0B0B0" w:sz="1"/>
+              <w:left w:val="single" w:color="B0B0B0" w:sz="1"/>
+              <w:bottom w:val="single" w:color="B0B0B0" w:sz="1"/>
+              <w:right w:val="single" w:color="B0B0B0" w:sz="1"/>
+            </w:tcBorders>
+            <w:shd w:fill="F2F2F2" w:val="clear"/>
+            <w:tcMar>
+              <w:top w:type="dxa" w:w="80"/>
+              <w:left w:type="dxa" w:w="120"/>
+              <w:bottom w:type="dxa" w:w="80"/>
+              <w:right w:type="dxa" w:w="120"/>
+            </w:tcMar>
+          </w:tcPr>
+          <w:p>
+            <w:r>
+              <w:rPr>
+                <w:rFonts w:ascii="Arial" w:cs="Arial" w:eastAsia="Arial" w:hAnsi="Arial"/>
+                <w:sz w:val="20"/>
+                <w:szCs w:val="20"/>
+              </w:rPr>
+              <w:t xml:space="preserve">helmet</w:t>
+            </w:r>
+          </w:p>
+        </w:tc>
+      </w:tr>
+      <w:tr>
+        <w:tc>
+          <w:tcPr>
+            <w:tcW w:type="dxa" w:w="3000"/>
+            <w:tcBorders>
+              <w:top w:val="single" w:color="B0B0B0" w:sz="1"/>
+              <w:left w:val="single" w:color="B0B0B0" w:sz="1"/>
+              <w:bottom w:val="single" w:color="B0B0B0" w:sz="1"/>
+              <w:right w:val="single" w:color="B0B0B0" w:sz="1"/>
+            </w:tcBorders>
+            <w:tcMar>
+              <w:top w:type="dxa" w:w="80"/>
+              <w:left w:type="dxa" w:w="120"/>
+              <w:bottom w:type="dxa" w:w="80"/>
+              <w:right w:type="dxa" w:w="120"/>
+            </w:tcMar>
+          </w:tcPr>
+          <w:p>
+            <w:r>
+              <w:rPr>
+                <w:rFonts w:ascii="Arial" w:cs="Arial" w:eastAsia="Arial" w:hAnsi="Arial"/>
+                <w:sz w:val="20"/>
+                <w:szCs w:val="20"/>
+              </w:rPr>
+              <w:t xml:space="preserve">Validación</w:t>
+            </w:r>
+          </w:p>
+        </w:tc>
+        <w:tc>
+          <w:tcPr>
+            <w:tcW w:type="dxa" w:w="6360"/>
+            <w:tcBorders>
+              <w:top w:val="single" w:color="B0B0B0" w:sz="1"/>
+              <w:left w:val="single" w:color="B0B0B0" w:sz="1"/>
+              <w:bottom w:val="single" w:color="B0B0B0" w:sz="1"/>
+              <w:right w:val="single" w:color="B0B0B0" w:sz="1"/>
+            </w:tcBorders>
+            <w:tcMar>
+              <w:top w:type="dxa" w:w="80"/>
+              <w:left w:type="dxa" w:w="120"/>
+              <w:bottom w:type="dxa" w:w="80"/>
+              <w:right w:type="dxa" w:w="120"/>
+            </w:tcMar>
+          </w:tcPr>
+          <w:p>
+            <w:r>
+              <w:rPr>
+                <w:rFonts w:ascii="Arial" w:cs="Arial" w:eastAsia="Arial" w:hAnsi="Arial"/>
+                <w:sz w:val="20"/>
+                <w:szCs w:val="20"/>
+              </w:rPr>
+              <w:t xml:space="preserve">class-validator · class-transformer</w:t>
+            </w:r>
+          </w:p>
+        </w:tc>
+      </w:tr>
+      <w:tr>
+        <w:tc>
+          <w:tcPr>
+            <w:tcW w:type="dxa" w:w="3000"/>
+            <w:tcBorders>
+              <w:top w:val="single" w:color="B0B0B0" w:sz="1"/>
+              <w:left w:val="single" w:color="B0B0B0" w:sz="1"/>
+              <w:bottom w:val="single" w:color="B0B0B0" w:sz="1"/>
+              <w:right w:val="single" w:color="B0B0B0" w:sz="1"/>
+            </w:tcBorders>
+            <w:shd w:fill="F2F2F2" w:val="clear"/>
+            <w:tcMar>
+              <w:top w:type="dxa" w:w="80"/>
+              <w:left w:type="dxa" w:w="120"/>
+              <w:bottom w:type="dxa" w:w="80"/>
+              <w:right w:type="dxa" w:w="120"/>
+            </w:tcMar>
+          </w:tcPr>
+          <w:p>
+            <w:r>
+              <w:rPr>
+                <w:rFonts w:ascii="Arial" w:cs="Arial" w:eastAsia="Arial" w:hAnsi="Arial"/>
+                <w:sz w:val="20"/>
+                <w:szCs w:val="20"/>
+              </w:rPr>
+              <w:t xml:space="preserve">Documentación API</w:t>
+            </w:r>
+          </w:p>
+        </w:tc>
+        <w:tc>
+          <w:tcPr>
+            <w:tcW w:type="dxa" w:w="6360"/>
+            <w:tcBorders>
+              <w:top w:val="single" w:color="B0B0B0" w:sz="1"/>
+              <w:left w:val="single" w:color="B0B0B0" w:sz="1"/>
+              <w:bottom w:val="single" w:color="B0B0B0" w:sz="1"/>
+              <w:right w:val="single" w:color="B0B0B0" w:sz="1"/>
+            </w:tcBorders>
+            <w:shd w:fill="F2F2F2" w:val="clear"/>
+            <w:tcMar>
+              <w:top w:type="dxa" w:w="80"/>
+              <w:left w:type="dxa" w:w="120"/>
+              <w:bottom w:type="dxa" w:w="80"/>
+              <w:right w:type="dxa" w:w="120"/>
+            </w:tcMar>
+          </w:tcPr>
+          <w:p>
+            <w:r>
+              <w:rPr>
+                <w:rFonts w:ascii="Arial" w:cs="Arial" w:eastAsia="Arial" w:hAnsi="Arial"/>
+                <w:sz w:val="20"/>
+                <w:szCs w:val="20"/>
+              </w:rPr>
+              <w:t xml:space="preserve">@nestjs/swagger (OpenAPI)</w:t>
+            </w:r>
+          </w:p>
+        </w:tc>
+      </w:tr>
+      <w:tr>
+        <w:tc>
+          <w:tcPr>
+            <w:tcW w:type="dxa" w:w="3000"/>
+            <w:tcBorders>
+              <w:top w:val="single" w:color="B0B0B0" w:sz="1"/>
+              <w:left w:val="single" w:color="B0B0B0" w:sz="1"/>
+              <w:bottom w:val="single" w:color="B0B0B0" w:sz="1"/>
+              <w:right w:val="single" w:color="B0B0B0" w:sz="1"/>
+            </w:tcBorders>
+            <w:tcMar>
+              <w:top w:type="dxa" w:w="80"/>
+              <w:left w:type="dxa" w:w="120"/>
+              <w:bottom w:type="dxa" w:w="80"/>
+              <w:right w:type="dxa" w:w="120"/>
+            </w:tcMar>
+          </w:tcPr>
+          <w:p>
+            <w:r>
+              <w:rPr>
+                <w:rFonts w:ascii="Arial" w:cs="Arial" w:eastAsia="Arial" w:hAnsi="Arial"/>
+                <w:sz w:val="20"/>
+                <w:szCs w:val="20"/>
+              </w:rPr>
+              <w:t xml:space="preserve">Configuración</w:t>
+            </w:r>
+          </w:p>
+        </w:tc>
+        <w:tc>
+          <w:tcPr>
+            <w:tcW w:type="dxa" w:w="6360"/>
+            <w:tcBorders>
+              <w:top w:val="single" w:color="B0B0B0" w:sz="1"/>
+              <w:left w:val="single" w:color="B0B0B0" w:sz="1"/>
+              <w:bottom w:val="single" w:color="B0B0B0" w:sz="1"/>
+              <w:right w:val="single" w:color="B0B0B0" w:sz="1"/>
+            </w:tcBorders>
+            <w:tcMar>
+              <w:top w:type="dxa" w:w="80"/>
+              <w:left w:type="dxa" w:w="120"/>
+              <w:bottom w:type="dxa" w:w="80"/>
+              <w:right w:type="dxa" w:w="120"/>
+            </w:tcMar>
+          </w:tcPr>
+          <w:p>
+            <w:r>
+              <w:rPr>
+                <w:rFonts w:ascii="Arial" w:cs="Arial" w:eastAsia="Arial" w:hAnsi="Arial"/>
+                <w:sz w:val="20"/>
+                <w:szCs w:val="20"/>
+              </w:rPr>
+              <w:t xml:space="preserve">@nestjs/config</w:t>
+            </w:r>
+          </w:p>
+        </w:tc>
+      </w:tr>
+      <w:tr>
+        <w:tc>
+          <w:tcPr>
+            <w:tcW w:type="dxa" w:w="3000"/>
+            <w:tcBorders>
+              <w:top w:val="single" w:color="B0B0B0" w:sz="1"/>
+              <w:left w:val="single" w:color="B0B0B0" w:sz="1"/>
+              <w:bottom w:val="single" w:color="B0B0B0" w:sz="1"/>
+              <w:right w:val="single" w:color="B0B0B0" w:sz="1"/>
+            </w:tcBorders>
+            <w:shd w:fill="F2F2F2" w:val="clear"/>
+            <w:tcMar>
+              <w:top w:type="dxa" w:w="80"/>
+              <w:left w:type="dxa" w:w="120"/>
+              <w:bottom w:type="dxa" w:w="80"/>
+              <w:right w:type="dxa" w:w="120"/>
+            </w:tcMar>
+          </w:tcPr>
+          <w:p>
+            <w:r>
+              <w:rPr>
+                <w:rFonts w:ascii="Arial" w:cs="Arial" w:eastAsia="Arial" w:hAnsi="Arial"/>
+                <w:sz w:val="20"/>
+                <w:szCs w:val="20"/>
+              </w:rPr>
+              <w:t xml:space="preserve">Pruebas</w:t>
+            </w:r>
+          </w:p>
+        </w:tc>
+        <w:tc>
+          <w:tcPr>
+            <w:tcW w:type="dxa" w:w="6360"/>
+            <w:tcBorders>
+              <w:top w:val="single" w:color="B0B0B0" w:sz="1"/>
+              <w:left w:val="single" w:color="B0B0B0" w:sz="1"/>
+              <w:bottom w:val="single" w:color="B0B0B0" w:sz="1"/>
+              <w:right w:val="single" w:color="B0B0B0" w:sz="1"/>
+            </w:tcBorders>
+            <w:shd w:fill="F2F2F2" w:val="clear"/>
+            <w:tcMar>
+              <w:top w:type="dxa" w:w="80"/>
+              <w:left w:type="dxa" w:w="120"/>
+              <w:bottom w:type="dxa" w:w="80"/>
+              <w:right w:type="dxa" w:w="120"/>
+            </w:tcMar>
+          </w:tcPr>
+          <w:p>
+            <w:r>
+              <w:rPr>
+                <w:rFonts w:ascii="Arial" w:cs="Arial" w:eastAsia="Arial" w:hAnsi="Arial"/>
+                <w:sz w:val="20"/>
+                <w:szCs w:val="20"/>
+              </w:rPr>
+              <w:t xml:space="preserve">jest · supertest (cobertura lcov ≥80% → SonarQube)</w:t>
+            </w:r>
+          </w:p>
+        </w:tc>
+      </w:tr>
+      <w:tr>
+        <w:tc>
+          <w:tcPr>
+            <w:tcW w:type="dxa" w:w="3000"/>
+            <w:tcBorders>
+              <w:top w:val="single" w:color="B0B0B0" w:sz="1"/>
+              <w:left w:val="single" w:color="B0B0B0" w:sz="1"/>
+              <w:bottom w:val="single" w:color="B0B0B0" w:sz="1"/>
+              <w:right w:val="single" w:color="B0B0B0" w:sz="1"/>
+            </w:tcBorders>
+            <w:tcMar>
+              <w:top w:type="dxa" w:w="80"/>
+              <w:left w:type="dxa" w:w="120"/>
+              <w:bottom w:type="dxa" w:w="80"/>
+              <w:right w:type="dxa" w:w="120"/>
+            </w:tcMar>
+          </w:tcPr>
+          <w:p>
+            <w:r>
+              <w:rPr>
+                <w:rFonts w:ascii="Arial" w:cs="Arial" w:eastAsia="Arial" w:hAnsi="Arial"/>
+                <w:sz w:val="20"/>
+                <w:szCs w:val="20"/>
+              </w:rPr>
+              <w:t xml:space="preserve">Contenedor / CI-CD</w:t>
+            </w:r>
+          </w:p>
+        </w:tc>
+        <w:tc>
+          <w:tcPr>
+            <w:tcW w:type="dxa" w:w="6360"/>
+            <w:tcBorders>
+              <w:top w:val="single" w:color="B0B0B0" w:sz="1"/>
+              <w:left w:val="single" w:color="B0B0B0" w:sz="1"/>
+              <w:bottom w:val="single" w:color="B0B0B0" w:sz="1"/>
+              <w:right w:val="single" w:color="B0B0B0" w:sz="1"/>
+            </w:tcBorders>
+            <w:tcMar>
+              <w:top w:type="dxa" w:w="80"/>
+              <w:left w:type="dxa" w:w="120"/>
+              <w:bottom w:type="dxa" w:w="80"/>
+              <w:right w:type="dxa" w:w="120"/>
+            </w:tcMar>
+          </w:tcPr>
+          <w:p>
+            <w:r>
+              <w:rPr>
+                <w:rFonts w:ascii="Arial" w:cs="Arial" w:eastAsia="Arial" w:hAnsi="Arial"/>
+                <w:sz w:val="20"/>
+                <w:szCs w:val="20"/>
+              </w:rPr>
+              <w:t xml:space="preserve">Docker (node:20-slim) · Cloud Build · Cloud Run · Artifact Registry · Secret Manager</w:t>
+            </w:r>
+          </w:p>
+        </w:tc>
+      </w:tr>
+    </w:tbl>
+    <w:p>
+      <w:pPr>
+        <w:pStyle w:val="Heading1"/>
+        <w:spacing w:after="160" w:before="280"/>
+      </w:pPr>
+      <w:r>
+        <w:rPr>
+          <w:rFonts w:ascii="Arial" w:cs="Arial" w:eastAsia="Arial" w:hAnsi="Arial"/>
+          <w:b/>
+          <w:bCs/>
+          <w:color w:val="002858"/>
+          <w:sz w:val="30"/>
+          <w:szCs w:val="30"/>
+        </w:rPr>
+        <w:t xml:space="preserve">14. Conclusión</w:t>
       </w:r>
     </w:p>
     <w:p>

</xml_diff>

<commit_message>
feat: reads via POST (search/list) — cédula out of the URL (Farmatodo P2C)
- POST /employees/search (idNumber in body) replaces GET /employees/:id
- POST /employees/list (page/size in body) replaces GET /employees
- SearchEmployeeDto; controller/e2e/unit tests updated (79 unit + 15 e2e green)
- Postman, cURL guide (md+docx), SDD (md+docx), README updated to POST reads

Co-Authored-By: Claude Fable 5 <noreply@anthropic.com>
</commit_message>
<xml_diff>
--- a/docs/sdd/SDD-employee-api-spi-v1.0.docx
+++ b/docs/sdd/SDD-employee-api-spi-v1.0.docx
@@ -2950,7 +2950,7 @@
           <w:sz w:val="24"/>
           <w:szCs w:val="24"/>
         </w:rPr>
-        <w:t xml:space="preserve">GET /api/v1/employees/{idNumber}</w:t>
+        <w:t xml:space="preserve">POST /api/v1/employees/search</w:t>
       </w:r>
     </w:p>
     <w:p>
@@ -2963,7 +2963,7 @@
           <w:sz w:val="22"/>
           <w:szCs w:val="22"/>
         </w:rPr>
-        <w:t xml:space="preserve">Consulta por identificación vía prc_get_employee (I_JSON {"idNumber":"..."}); el PKG responde O_JSON {"employees":[...]} con claves en inglés y sexo decodificado a M/F. No existe → 404.</w:t>
+        <w:t xml:space="preserve">Consulta por identificación vía prc_get_employee. Lectura por POST (estándar Farmatodo P2C): el idNumber viaja en el body (cifrable como RequestJson), nunca en la URL, para no filtrar la cédula en logs/proxies. Request: {"idNumber":"12345678"}. No existe → 404.</w:t>
       </w:r>
     </w:p>
     <w:p>
@@ -2980,7 +2980,7 @@
           <w:sz w:val="24"/>
           <w:szCs w:val="24"/>
         </w:rPr>
-        <w:t xml:space="preserve">GET /api/v1/employees?page=1&amp;size=20</w:t>
+        <w:t xml:space="preserve">POST /api/v1/employees/list</w:t>
       </w:r>
     </w:p>
     <w:p>
@@ -2993,7 +2993,7 @@
           <w:sz w:val="22"/>
           <w:szCs w:val="22"/>
         </w:rPr>
-        <w:t xml:space="preserve">Listado paginado (OFFSET/FETCH en el PKG). size máximo 100. Sin registros → lista vacía con 200.</w:t>
+        <w:t xml:space="preserve">Listado paginado (OFFSET/FETCH en el PKG); page/size en el body. Request: {"page":1,"size":20}. size máximo 100. Sin registros → lista vacía con 200.</w:t>
       </w:r>
     </w:p>
     <w:p>

</xml_diff>

<commit_message>
feat: update/delete via POST too — no cédula in any URL (full P2C)
- POST /employees/update (idNumber+fields in body), POST /employees/delete (idNumber in body)
- UpdateEmployeeDto now requires idNumber; controller has no :id routes left
- tests, Postman, cURL (md+docx), SDD (md+docx), README updated
- 79 unit + 15 e2e green

Co-Authored-By: Claude Fable 5 <noreply@anthropic.com>
</commit_message>
<xml_diff>
--- a/docs/sdd/SDD-employee-api-spi-v1.0.docx
+++ b/docs/sdd/SDD-employee-api-spi-v1.0.docx
@@ -3010,7 +3010,7 @@
           <w:sz w:val="24"/>
           <w:szCs w:val="24"/>
         </w:rPr>
-        <w:t xml:space="preserve">PUT /api/v1/employees/{idNumber}</w:t>
+        <w:t xml:space="preserve">POST /api/v1/employees/update</w:t>
       </w:r>
     </w:p>
     <w:p>
@@ -3023,7 +3023,7 @@
           <w:sz w:val="22"/>
           <w:szCs w:val="22"/>
         </w:rPr>
-        <w:t xml:space="preserve">Actualización parcial: verifica existencia (404 si no existe), reutiliza prc_merge_employee (rama WHEN MATCHED del MERGE) y devuelve el empleado actualizado. Body vacío → 422.</w:t>
+        <w:t xml:space="preserve">Actualización parcial: idNumber (requerido) + campos a actualizar en el body. Verifica existencia (404 si no existe), reutiliza prc_merge_employee (rama WHEN MATCHED del MERGE) y devuelve el empleado actualizado.</w:t>
       </w:r>
     </w:p>
     <w:p>
@@ -3040,7 +3040,7 @@
           <w:sz w:val="24"/>
           <w:szCs w:val="24"/>
         </w:rPr>
-        <w:t xml:space="preserve">DELETE /api/v1/employees/{idNumber}</w:t>
+        <w:t xml:space="preserve">POST /api/v1/employees/delete</w:t>
       </w:r>
     </w:p>
     <w:p>
@@ -3053,7 +3053,7 @@
           <w:sz w:val="22"/>
           <w:szCs w:val="22"/>
         </w:rPr>
-        <w:t xml:space="preserve">Borrado lógico vía prc_delete_employee: IN_REL_TRAB = N + auditoría USRACT/FECACT. Responde 204. No existe → 404.</w:t>
+        <w:t xml:space="preserve">Borrado lógico vía prc_delete_employee: IN_REL_TRAB = N + auditoría USRACT/FECACT. idNumber en el body. Responde 204. No existe → 404.</w:t>
       </w:r>
     </w:p>
     <w:p>

</xml_diff>